<commit_message>
small changes to Conflict lab
</commit_message>
<xml_diff>
--- a/ADXD2SD3M5-Mike/GIT/Lab 1 - Git getting started.docx
+++ b/ADXD2SD3M5-Mike/GIT/Lab 1 - Git getting started.docx
@@ -1066,6 +1066,47 @@
     </w:p>
     <w:p>
       <w:pPr>
+        <w:rPr>
+          <w:rFonts w:ascii="Courier New" w:hAnsi="Courier New" w:cs="Courier New"/>
+          <w:b/>
+          <w:bCs/>
+        </w:rPr>
+      </w:pPr>
+      <w:r>
+        <w:rPr>
+          <w:rFonts w:ascii="Courier New" w:hAnsi="Courier New" w:cs="Courier New"/>
+          <w:b/>
+          <w:bCs/>
+        </w:rPr>
+        <w:t xml:space="preserve">Note: </w:t>
+      </w:r>
+      <w:r>
+        <w:t>T</w:t>
+      </w:r>
+      <w:r>
+        <w:t>o add all changes in all folders type:</w:t>
+      </w:r>
+      <w:r>
+        <w:rPr>
+          <w:rFonts w:ascii="Courier New" w:hAnsi="Courier New" w:cs="Courier New"/>
+          <w:b/>
+          <w:bCs/>
+        </w:rPr>
+        <w:t xml:space="preserve"> git add </w:t>
+      </w:r>
+      <w:r>
+        <w:rPr>
+          <w:rFonts w:ascii="Courier New" w:hAnsi="Courier New" w:cs="Courier New"/>
+          <w:b/>
+          <w:bCs/>
+          <w:sz w:val="44"/>
+          <w:szCs w:val="44"/>
+        </w:rPr>
+        <w:t>.</w:t>
+      </w:r>
+    </w:p>
+    <w:p>
+      <w:pPr>
         <w:pStyle w:val="Heading3"/>
       </w:pPr>
       <w:r>
@@ -1086,7 +1127,23 @@
           <w:b/>
           <w:bCs/>
         </w:rPr>
-        <w:t>git commit -m "Initial commit: added homepage"</w:t>
+        <w:t>git commit -m "Initial commit: added home</w:t>
+      </w:r>
+      <w:r>
+        <w:rPr>
+          <w:rFonts w:ascii="Courier New" w:hAnsi="Courier New" w:cs="Courier New"/>
+          <w:b/>
+          <w:bCs/>
+        </w:rPr>
+        <w:t xml:space="preserve"> </w:t>
+      </w:r>
+      <w:r>
+        <w:rPr>
+          <w:rFonts w:ascii="Courier New" w:hAnsi="Courier New" w:cs="Courier New"/>
+          <w:b/>
+          <w:bCs/>
+        </w:rPr>
+        <w:t>page"</w:t>
       </w:r>
     </w:p>
     <w:p>
@@ -1103,12 +1160,18 @@
       </w:r>
     </w:p>
     <w:p>
+      <w:pPr>
+        <w:keepNext/>
+        <w:keepLines/>
+      </w:pPr>
       <w:r>
         <w:t>Edit index.html and add a paragraph:</w:t>
       </w:r>
     </w:p>
     <w:p>
       <w:pPr>
+        <w:keepNext/>
+        <w:keepLines/>
         <w:ind w:firstLine="720"/>
         <w:rPr>
           <w:b/>
@@ -1200,87 +1263,104 @@
         <w:t>&gt;</w:t>
       </w:r>
     </w:p>
+    <w:p>
+      <w:pPr>
+        <w:keepNext/>
+        <w:keepLines/>
+      </w:pPr>
+    </w:p>
+    <w:p>
+      <w:pPr>
+        <w:keepNext/>
+        <w:keepLines/>
+      </w:pPr>
+      <w:r>
+        <w:t>Check status again:</w:t>
+      </w:r>
+    </w:p>
+    <w:p>
+      <w:pPr>
+        <w:keepNext/>
+        <w:keepLines/>
+        <w:rPr>
+          <w:rFonts w:ascii="Courier New" w:hAnsi="Courier New" w:cs="Courier New"/>
+          <w:b/>
+          <w:bCs/>
+        </w:rPr>
+      </w:pPr>
+      <w:r>
+        <w:rPr>
+          <w:rFonts w:ascii="Courier New" w:hAnsi="Courier New" w:cs="Courier New"/>
+          <w:b/>
+          <w:bCs/>
+        </w:rPr>
+        <w:t>git status</w:t>
+      </w:r>
+    </w:p>
+    <w:p>
+      <w:pPr>
+        <w:keepNext/>
+        <w:keepLines/>
+        <w:rPr>
+          <w:rFonts w:ascii="Courier New" w:hAnsi="Courier New" w:cs="Courier New"/>
+          <w:b/>
+          <w:bCs/>
+        </w:rPr>
+      </w:pPr>
+    </w:p>
+    <w:p>
+      <w:pPr>
+        <w:keepNext/>
+        <w:keepLines/>
+      </w:pPr>
+      <w:r>
+        <w:t>Add and commit:</w:t>
+      </w:r>
+    </w:p>
+    <w:p>
+      <w:pPr>
+        <w:keepNext/>
+        <w:keepLines/>
+        <w:rPr>
+          <w:rFonts w:ascii="Courier New" w:hAnsi="Courier New" w:cs="Courier New"/>
+          <w:b/>
+          <w:bCs/>
+        </w:rPr>
+      </w:pPr>
+      <w:r>
+        <w:rPr>
+          <w:rFonts w:ascii="Courier New" w:hAnsi="Courier New" w:cs="Courier New"/>
+          <w:b/>
+          <w:bCs/>
+        </w:rPr>
+        <w:t>git add index.html</w:t>
+      </w:r>
+    </w:p>
+    <w:p>
+      <w:pPr>
+        <w:keepNext/>
+        <w:keepLines/>
+        <w:rPr>
+          <w:rFonts w:ascii="Courier New" w:hAnsi="Courier New" w:cs="Courier New"/>
+          <w:b/>
+          <w:bCs/>
+        </w:rPr>
+      </w:pPr>
+      <w:r>
+        <w:rPr>
+          <w:rFonts w:ascii="Courier New" w:hAnsi="Courier New" w:cs="Courier New"/>
+          <w:b/>
+          <w:bCs/>
+        </w:rPr>
+        <w:t>git commit -m "Added introduction paragraph"</w:t>
+      </w:r>
+    </w:p>
     <w:p/>
     <w:p>
-      <w:r>
-        <w:t>Check status again:</w:t>
-      </w:r>
-    </w:p>
-    <w:p>
-      <w:pPr>
-        <w:rPr>
-          <w:rFonts w:ascii="Courier New" w:hAnsi="Courier New" w:cs="Courier New"/>
-          <w:b/>
-          <w:bCs/>
-        </w:rPr>
-      </w:pPr>
-      <w:r>
-        <w:rPr>
-          <w:rFonts w:ascii="Courier New" w:hAnsi="Courier New" w:cs="Courier New"/>
-          <w:b/>
-          <w:bCs/>
-        </w:rPr>
-        <w:t>git status</w:t>
-      </w:r>
-    </w:p>
-    <w:p>
-      <w:pPr>
-        <w:rPr>
-          <w:rFonts w:ascii="Courier New" w:hAnsi="Courier New" w:cs="Courier New"/>
-          <w:b/>
-          <w:bCs/>
-        </w:rPr>
-      </w:pPr>
-      <w:r>
-        <w:rPr>
-          <w:rFonts w:ascii="Courier New" w:hAnsi="Courier New" w:cs="Courier New"/>
-          <w:b/>
-          <w:bCs/>
-        </w:rPr>
-        <w:t>Add and commit:</w:t>
-      </w:r>
-    </w:p>
-    <w:p>
-      <w:pPr>
-        <w:rPr>
-          <w:rFonts w:ascii="Courier New" w:hAnsi="Courier New" w:cs="Courier New"/>
-          <w:b/>
-          <w:bCs/>
-        </w:rPr>
-      </w:pPr>
-      <w:r>
-        <w:rPr>
-          <w:rFonts w:ascii="Courier New" w:hAnsi="Courier New" w:cs="Courier New"/>
-          <w:b/>
-          <w:bCs/>
-        </w:rPr>
-        <w:t>git add index.html</w:t>
-      </w:r>
-    </w:p>
-    <w:p>
-      <w:pPr>
-        <w:rPr>
-          <w:rFonts w:ascii="Courier New" w:hAnsi="Courier New" w:cs="Courier New"/>
-          <w:b/>
-          <w:bCs/>
-        </w:rPr>
-      </w:pPr>
-      <w:r>
-        <w:rPr>
-          <w:rFonts w:ascii="Courier New" w:hAnsi="Courier New" w:cs="Courier New"/>
-          <w:b/>
-          <w:bCs/>
-        </w:rPr>
-        <w:t>git commit -m "Added introduction paragraph"</w:t>
-      </w:r>
-    </w:p>
-    <w:p/>
-    <w:p>
       <w:pPr>
         <w:pStyle w:val="Heading2"/>
       </w:pPr>
       <w:r>
-        <w:lastRenderedPageBreak/>
         <w:t>Part 7: Remote Repositories</w:t>
       </w:r>
     </w:p>
@@ -1318,15 +1398,26 @@
       <w:r>
         <w:t>Go to GitHub and create a new repository named:</w:t>
       </w:r>
-    </w:p>
-    <w:p>
-      <w:r>
+      <w:r>
+        <w:t xml:space="preserve">  </w:t>
+      </w:r>
+      <w:r>
+        <w:rPr>
+          <w:b/>
+          <w:bCs/>
+        </w:rPr>
         <w:t>portfolio-site</w:t>
       </w:r>
     </w:p>
     <w:p>
       <w:r>
-        <w:t>Do NOT initialize it with a README.</w:t>
+        <w:rPr>
+          <w:u w:val="single"/>
+        </w:rPr>
+        <w:t>Do NOT</w:t>
+      </w:r>
+      <w:r>
+        <w:t xml:space="preserve"> initialize it with a README.</w:t>
       </w:r>
     </w:p>
     <w:p/>
@@ -1400,7 +1491,6 @@
     <w:p>
       <w:pPr>
         <w:rPr>
-          <w:rFonts w:ascii="Courier New" w:hAnsi="Courier New" w:cs="Courier New"/>
           <w:b/>
           <w:bCs/>
         </w:rPr>
@@ -1413,6 +1503,133 @@
         </w:rPr>
         <w:t>git push -u origin main</w:t>
       </w:r>
+      <w:r>
+        <w:rPr>
+          <w:rFonts w:ascii="Courier New" w:hAnsi="Courier New" w:cs="Courier New"/>
+          <w:b/>
+          <w:bCs/>
+        </w:rPr>
+        <w:br/>
+      </w:r>
+      <w:r>
+        <w:rPr>
+          <w:rFonts w:ascii="Courier New" w:hAnsi="Courier New" w:cs="Courier New"/>
+          <w:b/>
+          <w:bCs/>
+        </w:rPr>
+        <w:br/>
+      </w:r>
+      <w:r>
+        <w:rPr>
+          <w:rStyle w:val="Heading2Char"/>
+        </w:rPr>
+        <w:t>Note:</w:t>
+      </w:r>
+      <w:r>
+        <w:rPr>
+          <w:rFonts w:ascii="Courier New" w:hAnsi="Courier New" w:cs="Courier New"/>
+          <w:b/>
+          <w:bCs/>
+        </w:rPr>
+        <w:br/>
+      </w:r>
+      <w:r>
+        <w:rPr>
+          <w:b/>
+          <w:bCs/>
+        </w:rPr>
+        <w:t>After this initial commit, you may submit any changes by simply typing:</w:t>
+      </w:r>
+    </w:p>
+    <w:p>
+      <w:pPr>
+        <w:keepNext/>
+        <w:keepLines/>
+        <w:rPr>
+          <w:rFonts w:ascii="Courier New" w:hAnsi="Courier New" w:cs="Courier New"/>
+          <w:b/>
+          <w:bCs/>
+        </w:rPr>
+      </w:pPr>
+      <w:r>
+        <w:rPr>
+          <w:b/>
+          <w:bCs/>
+        </w:rPr>
+        <w:br/>
+      </w:r>
+      <w:r>
+        <w:rPr>
+          <w:rFonts w:ascii="Courier New" w:hAnsi="Courier New" w:cs="Courier New"/>
+          <w:b/>
+          <w:bCs/>
+        </w:rPr>
+        <w:t xml:space="preserve">git add </w:t>
+      </w:r>
+      <w:r>
+        <w:rPr>
+          <w:rFonts w:ascii="Courier New" w:hAnsi="Courier New" w:cs="Courier New"/>
+          <w:b/>
+          <w:bCs/>
+          <w:sz w:val="32"/>
+          <w:szCs w:val="32"/>
+        </w:rPr>
+        <w:t>.</w:t>
+      </w:r>
+    </w:p>
+    <w:p>
+      <w:pPr>
+        <w:keepNext/>
+        <w:keepLines/>
+        <w:rPr>
+          <w:rFonts w:ascii="Courier New" w:hAnsi="Courier New" w:cs="Courier New"/>
+          <w:b/>
+          <w:bCs/>
+        </w:rPr>
+      </w:pPr>
+      <w:r>
+        <w:rPr>
+          <w:rFonts w:ascii="Courier New" w:hAnsi="Courier New" w:cs="Courier New"/>
+          <w:b/>
+          <w:bCs/>
+        </w:rPr>
+        <w:t>git commit -m "</w:t>
+      </w:r>
+      <w:r>
+        <w:rPr>
+          <w:rFonts w:ascii="Courier New" w:hAnsi="Courier New" w:cs="Courier New"/>
+          <w:b/>
+          <w:bCs/>
+        </w:rPr>
+        <w:t>summary of the changes</w:t>
+      </w:r>
+      <w:r>
+        <w:rPr>
+          <w:rFonts w:ascii="Courier New" w:hAnsi="Courier New" w:cs="Courier New"/>
+          <w:b/>
+          <w:bCs/>
+        </w:rPr>
+        <w:t>"</w:t>
+      </w:r>
+    </w:p>
+    <w:p>
+      <w:pPr>
+        <w:keepNext/>
+        <w:keepLines/>
+        <w:rPr>
+          <w:rFonts w:ascii="Courier New" w:hAnsi="Courier New" w:cs="Courier New"/>
+          <w:b/>
+          <w:bCs/>
+        </w:rPr>
+      </w:pPr>
+      <w:r>
+        <w:rPr>
+          <w:rFonts w:ascii="Courier New" w:hAnsi="Courier New" w:cs="Courier New"/>
+          <w:b/>
+          <w:bCs/>
+        </w:rPr>
+        <w:t>git push</w:t>
+      </w:r>
     </w:p>
     <w:p>
       <w:pPr>
@@ -1431,6 +1648,13 @@
       <w:r>
         <w:t>Cloning copies a remote repo to your local machine.</w:t>
       </w:r>
+      <w:r>
+        <w:br/>
+        <w:t>For example, you may create another folder on your PC, open a Terminal window there and then type:</w:t>
+      </w:r>
+      <w:r>
+        <w:br/>
+      </w:r>
     </w:p>
     <w:p>
       <w:pPr>
@@ -1455,11 +1679,14 @@
         <w:pStyle w:val="Heading2"/>
       </w:pPr>
       <w:r>
+        <w:lastRenderedPageBreak/>
         <w:t>Part 10: Summary of Commands</w:t>
       </w:r>
     </w:p>
     <w:p>
       <w:pPr>
+        <w:keepNext/>
+        <w:keepLines/>
         <w:rPr>
           <w:rFonts w:ascii="Courier New" w:hAnsi="Courier New" w:cs="Courier New"/>
           <w:b/>
@@ -1495,6 +1722,8 @@
     </w:p>
     <w:p>
       <w:pPr>
+        <w:keepNext/>
+        <w:keepLines/>
         <w:rPr>
           <w:rFonts w:ascii="Courier New" w:hAnsi="Courier New" w:cs="Courier New"/>
           <w:b/>
@@ -1512,6 +1741,8 @@
     </w:p>
     <w:p>
       <w:pPr>
+        <w:keepNext/>
+        <w:keepLines/>
         <w:rPr>
           <w:rFonts w:ascii="Courier New" w:hAnsi="Courier New" w:cs="Courier New"/>
           <w:b/>
@@ -1529,6 +1760,8 @@
     </w:p>
     <w:p>
       <w:pPr>
+        <w:keepNext/>
+        <w:keepLines/>
         <w:rPr>
           <w:rFonts w:ascii="Courier New" w:hAnsi="Courier New" w:cs="Courier New"/>
           <w:b/>
@@ -1546,6 +1779,8 @@
     </w:p>
     <w:p>
       <w:pPr>
+        <w:keepNext/>
+        <w:keepLines/>
         <w:rPr>
           <w:rFonts w:ascii="Courier New" w:hAnsi="Courier New" w:cs="Courier New"/>
           <w:b/>
@@ -1563,6 +1798,8 @@
     </w:p>
     <w:p>
       <w:pPr>
+        <w:keepNext/>
+        <w:keepLines/>
         <w:rPr>
           <w:rFonts w:ascii="Courier New" w:hAnsi="Courier New" w:cs="Courier New"/>
           <w:b/>
@@ -1580,6 +1817,8 @@
     </w:p>
     <w:p>
       <w:pPr>
+        <w:keepNext/>
+        <w:keepLines/>
         <w:rPr>
           <w:b/>
           <w:bCs/>
@@ -1596,6 +1835,8 @@
     </w:p>
     <w:p>
       <w:pPr>
+        <w:keepNext/>
+        <w:keepLines/>
         <w:numPr>
           <w:ilvl w:val="0"/>
           <w:numId w:val="5"/>
@@ -1607,6 +1848,8 @@
     </w:p>
     <w:p>
       <w:pPr>
+        <w:keepNext/>
+        <w:keepLines/>
         <w:numPr>
           <w:ilvl w:val="0"/>
           <w:numId w:val="5"/>

</xml_diff>

<commit_message>
Added creating branch main to lab 1 Git
</commit_message>
<xml_diff>
--- a/ADXD2SD3M5-Mike/GIT/Lab 1 - Git getting started.docx
+++ b/ADXD2SD3M5-Mike/GIT/Lab 1 - Git getting started.docx
@@ -94,15 +94,7 @@
         </w:numPr>
       </w:pPr>
       <w:r>
-        <w:t xml:space="preserve">Use basic Git commands: </w:t>
-      </w:r>
-      <w:proofErr w:type="spellStart"/>
-      <w:r>
-        <w:t>init</w:t>
-      </w:r>
-      <w:proofErr w:type="spellEnd"/>
-      <w:r>
-        <w:t>, clone, add, status, commit, push</w:t>
+        <w:t>Use basic Git commands: init, clone, add, status, commit, push</w:t>
       </w:r>
     </w:p>
     <w:p/>
@@ -259,25 +251,7 @@
           <w:b/>
           <w:bCs/>
         </w:rPr>
-        <w:t xml:space="preserve">git config --global </w:t>
-      </w:r>
-      <w:proofErr w:type="spellStart"/>
-      <w:r>
-        <w:rPr>
-          <w:rFonts w:ascii="Courier New" w:hAnsi="Courier New" w:cs="Courier New"/>
-          <w:b/>
-          <w:bCs/>
-        </w:rPr>
-        <w:t>user.email</w:t>
-      </w:r>
-      <w:proofErr w:type="spellEnd"/>
-      <w:r>
-        <w:rPr>
-          <w:rFonts w:ascii="Courier New" w:hAnsi="Courier New" w:cs="Courier New"/>
-          <w:b/>
-          <w:bCs/>
-        </w:rPr>
-        <w:t xml:space="preserve"> your.email@example.com</w:t>
+        <w:t>git config --global user.email your.email@example.com</w:t>
       </w:r>
     </w:p>
     <w:p>
@@ -981,18 +955,8 @@
           <w:b/>
           <w:bCs/>
         </w:rPr>
-        <w:t xml:space="preserve">git </w:t>
-      </w:r>
-      <w:proofErr w:type="spellStart"/>
-      <w:r>
-        <w:rPr>
-          <w:rFonts w:ascii="Courier New" w:hAnsi="Courier New" w:cs="Courier New"/>
-          <w:b/>
-          <w:bCs/>
-        </w:rPr>
-        <w:t>init</w:t>
-      </w:r>
-      <w:proofErr w:type="spellEnd"/>
+        <w:t>git init</w:t>
+      </w:r>
     </w:p>
     <w:p/>
     <w:p>
@@ -1066,35 +1030,6 @@
     </w:p>
     <w:p>
       <w:pPr>
-        <w:rPr>
-          <w:rFonts w:ascii="Courier New" w:hAnsi="Courier New" w:cs="Courier New"/>
-          <w:b/>
-          <w:bCs/>
-        </w:rPr>
-      </w:pPr>
-      <w:r>
-        <w:rPr>
-          <w:rFonts w:ascii="Courier New" w:hAnsi="Courier New" w:cs="Courier New"/>
-          <w:b/>
-          <w:bCs/>
-        </w:rPr>
-        <w:t xml:space="preserve">Note: </w:t>
-      </w:r>
-      <w:r>
-        <w:t>T</w:t>
-      </w:r>
-      <w:r>
-        <w:t>o add all changes in all folders type:</w:t>
-      </w:r>
-      <w:r>
-        <w:rPr>
-          <w:rFonts w:ascii="Courier New" w:hAnsi="Courier New" w:cs="Courier New"/>
-          <w:b/>
-          <w:bCs/>
-        </w:rPr>
-        <w:t xml:space="preserve"> git add </w:t>
-      </w:r>
-      <w:r>
         <w:rPr>
           <w:rFonts w:ascii="Courier New" w:hAnsi="Courier New" w:cs="Courier New"/>
           <w:b/>
@@ -1102,6 +1037,37 @@
           <w:sz w:val="44"/>
           <w:szCs w:val="44"/>
         </w:rPr>
+      </w:pPr>
+      <w:r>
+        <w:rPr>
+          <w:rFonts w:ascii="Courier New" w:hAnsi="Courier New" w:cs="Courier New"/>
+          <w:b/>
+          <w:bCs/>
+        </w:rPr>
+        <w:t xml:space="preserve">Note: </w:t>
+      </w:r>
+      <w:r>
+        <w:t>T</w:t>
+      </w:r>
+      <w:r>
+        <w:t>o add all changes in all folders type:</w:t>
+      </w:r>
+      <w:r>
+        <w:rPr>
+          <w:rFonts w:ascii="Courier New" w:hAnsi="Courier New" w:cs="Courier New"/>
+          <w:b/>
+          <w:bCs/>
+        </w:rPr>
+        <w:t xml:space="preserve"> git add </w:t>
+      </w:r>
+      <w:r>
+        <w:rPr>
+          <w:rFonts w:ascii="Courier New" w:hAnsi="Courier New" w:cs="Courier New"/>
+          <w:b/>
+          <w:bCs/>
+          <w:sz w:val="44"/>
+          <w:szCs w:val="44"/>
+        </w:rPr>
         <w:t>.</w:t>
       </w:r>
     </w:p>
@@ -1110,7 +1076,66 @@
         <w:pStyle w:val="Heading3"/>
       </w:pPr>
       <w:r>
-        <w:t>Step 3: Commit Changes</w:t>
+        <w:t xml:space="preserve">Step </w:t>
+      </w:r>
+      <w:r>
+        <w:t>3</w:t>
+      </w:r>
+      <w:r>
+        <w:t xml:space="preserve">: </w:t>
+      </w:r>
+      <w:r>
+        <w:t>Create branch main</w:t>
+      </w:r>
+    </w:p>
+    <w:p>
+      <w:pPr>
+        <w:rPr>
+          <w:rFonts w:ascii="Courier New" w:hAnsi="Courier New" w:cs="Courier New"/>
+          <w:b/>
+          <w:bCs/>
+          <w:sz w:val="44"/>
+          <w:szCs w:val="44"/>
+        </w:rPr>
+      </w:pPr>
+      <w:r>
+        <w:rPr>
+          <w:rFonts w:ascii="Courier New" w:hAnsi="Courier New" w:cs="Courier New"/>
+          <w:b/>
+          <w:bCs/>
+        </w:rPr>
+        <w:t xml:space="preserve">git </w:t>
+      </w:r>
+      <w:r>
+        <w:rPr>
+          <w:rFonts w:ascii="Courier New" w:hAnsi="Courier New" w:cs="Courier New"/>
+          <w:b/>
+          <w:bCs/>
+        </w:rPr>
+        <w:t>branch -M main</w:t>
+      </w:r>
+    </w:p>
+    <w:p>
+      <w:pPr>
+        <w:rPr>
+          <w:rFonts w:ascii="Courier New" w:hAnsi="Courier New" w:cs="Courier New"/>
+          <w:b/>
+          <w:bCs/>
+        </w:rPr>
+      </w:pPr>
+    </w:p>
+    <w:p>
+      <w:pPr>
+        <w:pStyle w:val="Heading3"/>
+      </w:pPr>
+      <w:r>
+        <w:t xml:space="preserve">Step </w:t>
+      </w:r>
+      <w:r>
+        <w:t>4</w:t>
+      </w:r>
+      <w:r>
+        <w:t>: Commit Changes</w:t>
       </w:r>
     </w:p>
     <w:p>
@@ -1156,7 +1181,13 @@
         <w:pStyle w:val="Heading2"/>
       </w:pPr>
       <w:r>
-        <w:t>Part 6: Make Changes</w:t>
+        <w:t xml:space="preserve">Part </w:t>
+      </w:r>
+      <w:r>
+        <w:t>5</w:t>
+      </w:r>
+      <w:r>
+        <w:t>: Make Changes</w:t>
       </w:r>
     </w:p>
     <w:p>
@@ -1361,7 +1392,13 @@
         <w:pStyle w:val="Heading2"/>
       </w:pPr>
       <w:r>
-        <w:t>Part 7: Remote Repositories</w:t>
+        <w:t xml:space="preserve">Part </w:t>
+      </w:r>
+      <w:r>
+        <w:t>6</w:t>
+      </w:r>
+      <w:r>
+        <w:t>: Remote Repositories</w:t>
       </w:r>
     </w:p>
     <w:p>
@@ -1381,16 +1418,9 @@
     </w:p>
     <w:p>
       <w:pPr>
-        <w:rPr>
-          <w:b/>
-          <w:bCs/>
-        </w:rPr>
-      </w:pPr>
-      <w:r>
-        <w:rPr>
-          <w:b/>
-          <w:bCs/>
-        </w:rPr>
+        <w:pStyle w:val="Heading2"/>
+      </w:pPr>
+      <w:r>
         <w:t>Step 1: Create a Remote Repo</w:t>
       </w:r>
     </w:p>
@@ -1426,21 +1456,20 @@
         <w:pStyle w:val="Heading2"/>
       </w:pPr>
       <w:r>
-        <w:t>Part 8: Connect and Push</w:t>
-      </w:r>
-    </w:p>
-    <w:p>
-      <w:pPr>
-        <w:rPr>
-          <w:b/>
-          <w:bCs/>
-        </w:rPr>
-      </w:pPr>
-      <w:r>
-        <w:rPr>
-          <w:b/>
-          <w:bCs/>
-        </w:rPr>
+        <w:t xml:space="preserve">Part </w:t>
+      </w:r>
+      <w:r>
+        <w:t>7</w:t>
+      </w:r>
+      <w:r>
+        <w:t>: Connect and Push</w:t>
+      </w:r>
+    </w:p>
+    <w:p>
+      <w:pPr>
+        <w:pStyle w:val="Heading2"/>
+      </w:pPr>
+      <w:r>
         <w:t>Step 1: Link Remote Repo</w:t>
       </w:r>
     </w:p>
@@ -1475,16 +1504,9 @@
     </w:p>
     <w:p>
       <w:pPr>
-        <w:rPr>
-          <w:b/>
-          <w:bCs/>
-        </w:rPr>
-      </w:pPr>
-      <w:r>
-        <w:rPr>
-          <w:b/>
-          <w:bCs/>
-        </w:rPr>
+        <w:pStyle w:val="Heading2"/>
+      </w:pPr>
+      <w:r>
         <w:t>Step 2: Push Your Code</w:t>
       </w:r>
     </w:p>
@@ -1641,7 +1663,13 @@
         <w:pStyle w:val="Heading2"/>
       </w:pPr>
       <w:r>
-        <w:t>Part 9: Clone a Repository</w:t>
+        <w:t xml:space="preserve">Part </w:t>
+      </w:r>
+      <w:r>
+        <w:t>8</w:t>
+      </w:r>
+      <w:r>
+        <w:t>: Clone a Repository</w:t>
       </w:r>
     </w:p>
     <w:p>
@@ -1680,7 +1708,13 @@
       </w:pPr>
       <w:r>
         <w:lastRenderedPageBreak/>
-        <w:t>Part 10: Summary of Commands</w:t>
+        <w:t xml:space="preserve">Part </w:t>
+      </w:r>
+      <w:r>
+        <w:t>9</w:t>
+      </w:r>
+      <w:r>
+        <w:t>: Summary of Commands</w:t>
       </w:r>
     </w:p>
     <w:p>
@@ -1699,25 +1733,7 @@
           <w:b/>
           <w:bCs/>
         </w:rPr>
-        <w:t xml:space="preserve">git </w:t>
-      </w:r>
-      <w:proofErr w:type="spellStart"/>
-      <w:r>
-        <w:rPr>
-          <w:rFonts w:ascii="Courier New" w:hAnsi="Courier New" w:cs="Courier New"/>
-          <w:b/>
-          <w:bCs/>
-        </w:rPr>
-        <w:t>init</w:t>
-      </w:r>
-      <w:proofErr w:type="spellEnd"/>
-      <w:r>
-        <w:rPr>
-          <w:rFonts w:ascii="Courier New" w:hAnsi="Courier New" w:cs="Courier New"/>
-          <w:b/>
-          <w:bCs/>
-        </w:rPr>
-        <w:t xml:space="preserve">        # Start a repo</w:t>
+        <w:t>git init        # Start a repo</w:t>
       </w:r>
     </w:p>
     <w:p>

</xml_diff>